<commit_message>
Add screenshots to Week 6 report and fix SQL init for dev profile
</commit_message>
<xml_diff>
--- a/Jeevan_Kumar_Gujja_Week6_Report.docx
+++ b/Jeevan_Kumar_Gujja_Week6_Report.docx
@@ -7256,6 +7256,759 @@
           <w:szCs w:val="20"/>
         </w:rPr>
         <w:t xml:space="preserve">Add comprehensive integration tests with TestContainers</w:t>
+      </w:r>
+    </w:p>
+    <w:p>
+      <w:pPr>
+        <w:spacing w:after="100" w:before="100"/>
+      </w:pPr>
+      <w:r>
+        <w:t xml:space="preserve"/>
+      </w:r>
+    </w:p>
+    <w:p>
+      <w:r>
+        <w:br w:type="page"/>
+      </w:r>
+    </w:p>
+    <w:p>
+      <w:pPr>
+        <w:pStyle w:val="Heading1"/>
+        <w:pBdr>
+          <w:bottom w:val="single" w:color="2E75B6" w:sz="6" w:space="4"/>
+        </w:pBdr>
+        <w:spacing w:after="120" w:before="300"/>
+      </w:pPr>
+      <w:r>
+        <w:rPr>
+          <w:rFonts w:ascii="Arial" w:cs="Arial" w:eastAsia="Arial" w:hAnsi="Arial"/>
+          <w:b/>
+          <w:bCs/>
+          <w:color w:val="1F3864"/>
+          <w:sz w:val="28"/>
+          <w:szCs w:val="28"/>
+        </w:rPr>
+        <w:t xml:space="preserve">10.  Application Screenshots</w:t>
+      </w:r>
+    </w:p>
+    <w:p>
+      <w:pPr>
+        <w:pStyle w:val="Heading2"/>
+        <w:spacing w:after="80" w:before="200"/>
+      </w:pPr>
+      <w:r>
+        <w:rPr>
+          <w:rFonts w:ascii="Arial" w:cs="Arial" w:eastAsia="Arial" w:hAnsi="Arial"/>
+          <w:b/>
+          <w:bCs/>
+          <w:color w:val="2E75B6"/>
+          <w:sz w:val="24"/>
+          <w:szCs w:val="24"/>
+        </w:rPr>
+        <w:t xml:space="preserve">10.1  Login Page</w:t>
+      </w:r>
+    </w:p>
+    <w:p>
+      <w:pPr>
+        <w:spacing w:after="120" w:before="120"/>
+        <w:jc w:val="center"/>
+      </w:pPr>
+      <w:r>
+        <w:drawing>
+          <wp:inline distT="0" distB="0" distL="0" distR="0">
+            <wp:extent cx="5905500" cy="3714750"/>
+            <wp:effectExtent t="0" r="0" b="0" l="0"/>
+            <wp:docPr id="1" name="01_login_page.png" descr="01_login_page.png" title="01_login_page.png"/>
+            <wp:cNvGraphicFramePr>
+              <a:graphicFrameLocks xmlns:a="http://schemas.openxmlformats.org/drawingml/2006/main" noChangeAspect="1"/>
+            </wp:cNvGraphicFramePr>
+            <a:graphic xmlns:a="http://schemas.openxmlformats.org/drawingml/2006/main">
+              <a:graphicData uri="http://schemas.openxmlformats.org/drawingml/2006/picture">
+                <pic:pic xmlns:pic="http://schemas.openxmlformats.org/drawingml/2006/picture">
+                  <pic:nvPicPr>
+                    <pic:cNvPr id="0" name="" descr=""/>
+                    <pic:cNvPicPr>
+                      <a:picLocks noChangeAspect="1" noChangeArrowheads="1"/>
+                    </pic:cNvPicPr>
+                  </pic:nvPicPr>
+                  <pic:blipFill>
+                    <a:blip r:embed="rId9" cstate="none"/>
+                    <a:srcRect/>
+                    <a:stretch>
+                      <a:fillRect/>
+                    </a:stretch>
+                  </pic:blipFill>
+                  <pic:spPr bwMode="auto">
+                    <a:xfrm>
+                      <a:off x="0" y="0"/>
+                      <a:ext cx="5905500" cy="3714750"/>
+                    </a:xfrm>
+                    <a:prstGeom prst="rect">
+                      <a:avLst/>
+                    </a:prstGeom>
+                  </pic:spPr>
+                </pic:pic>
+              </a:graphicData>
+            </a:graphic>
+          </wp:inline>
+        </w:drawing>
+      </w:r>
+    </w:p>
+    <w:p>
+      <w:pPr>
+        <w:spacing w:after="160" w:before="0"/>
+        <w:jc w:val="center"/>
+      </w:pPr>
+      <w:r>
+        <w:rPr>
+          <w:rFonts w:ascii="Arial" w:cs="Arial" w:eastAsia="Arial" w:hAnsi="Arial"/>
+          <w:i/>
+          <w:iCs/>
+          <w:color w:val="666666"/>
+          <w:sz w:val="16"/>
+          <w:szCs w:val="16"/>
+        </w:rPr>
+        <w:t xml:space="preserve">Fig 1 — Task Management System Login Page (localhost:8080)</w:t>
+      </w:r>
+    </w:p>
+    <w:p>
+      <w:pPr>
+        <w:pStyle w:val="Heading2"/>
+        <w:spacing w:after="80" w:before="200"/>
+      </w:pPr>
+      <w:r>
+        <w:rPr>
+          <w:rFonts w:ascii="Arial" w:cs="Arial" w:eastAsia="Arial" w:hAnsi="Arial"/>
+          <w:b/>
+          <w:bCs/>
+          <w:color w:val="2E75B6"/>
+          <w:sz w:val="24"/>
+          <w:szCs w:val="24"/>
+        </w:rPr>
+        <w:t xml:space="preserve">10.2  Swagger API Overview</w:t>
+      </w:r>
+    </w:p>
+    <w:p>
+      <w:pPr>
+        <w:spacing w:after="120" w:before="120"/>
+        <w:jc w:val="center"/>
+      </w:pPr>
+      <w:r>
+        <w:drawing>
+          <wp:inline distT="0" distB="0" distL="0" distR="0">
+            <wp:extent cx="5905500" cy="3714750"/>
+            <wp:effectExtent t="0" r="0" b="0" l="0"/>
+            <wp:docPr id="1" name="02_swagger_overview.png" descr="02_swagger_overview.png" title="02_swagger_overview.png"/>
+            <wp:cNvGraphicFramePr>
+              <a:graphicFrameLocks xmlns:a="http://schemas.openxmlformats.org/drawingml/2006/main" noChangeAspect="1"/>
+            </wp:cNvGraphicFramePr>
+            <a:graphic xmlns:a="http://schemas.openxmlformats.org/drawingml/2006/main">
+              <a:graphicData uri="http://schemas.openxmlformats.org/drawingml/2006/picture">
+                <pic:pic xmlns:pic="http://schemas.openxmlformats.org/drawingml/2006/picture">
+                  <pic:nvPicPr>
+                    <pic:cNvPr id="0" name="" descr=""/>
+                    <pic:cNvPicPr>
+                      <a:picLocks noChangeAspect="1" noChangeArrowheads="1"/>
+                    </pic:cNvPicPr>
+                  </pic:nvPicPr>
+                  <pic:blipFill>
+                    <a:blip r:embed="rId10" cstate="none"/>
+                    <a:srcRect/>
+                    <a:stretch>
+                      <a:fillRect/>
+                    </a:stretch>
+                  </pic:blipFill>
+                  <pic:spPr bwMode="auto">
+                    <a:xfrm>
+                      <a:off x="0" y="0"/>
+                      <a:ext cx="5905500" cy="3714750"/>
+                    </a:xfrm>
+                    <a:prstGeom prst="rect">
+                      <a:avLst/>
+                    </a:prstGeom>
+                  </pic:spPr>
+                </pic:pic>
+              </a:graphicData>
+            </a:graphic>
+          </wp:inline>
+        </w:drawing>
+      </w:r>
+    </w:p>
+    <w:p>
+      <w:pPr>
+        <w:spacing w:after="160" w:before="0"/>
+        <w:jc w:val="center"/>
+      </w:pPr>
+      <w:r>
+        <w:rPr>
+          <w:rFonts w:ascii="Arial" w:cs="Arial" w:eastAsia="Arial" w:hAnsi="Arial"/>
+          <w:i/>
+          <w:iCs/>
+          <w:color w:val="666666"/>
+          <w:sz w:val="16"/>
+          <w:szCs w:val="16"/>
+        </w:rPr>
+        <w:t xml:space="preserve">Fig 2 — Swagger UI with all API groups (Admin, Comments, Projects, Tasks)</w:t>
+      </w:r>
+    </w:p>
+    <w:p>
+      <w:pPr>
+        <w:pStyle w:val="Heading2"/>
+        <w:spacing w:after="80" w:before="200"/>
+      </w:pPr>
+      <w:r>
+        <w:rPr>
+          <w:rFonts w:ascii="Arial" w:cs="Arial" w:eastAsia="Arial" w:hAnsi="Arial"/>
+          <w:b/>
+          <w:bCs/>
+          <w:color w:val="2E75B6"/>
+          <w:sz w:val="24"/>
+          <w:szCs w:val="24"/>
+        </w:rPr>
+        <w:t xml:space="preserve">10.3  Projects API Endpoints</w:t>
+      </w:r>
+    </w:p>
+    <w:p>
+      <w:pPr>
+        <w:spacing w:after="120" w:before="120"/>
+        <w:jc w:val="center"/>
+      </w:pPr>
+      <w:r>
+        <w:drawing>
+          <wp:inline distT="0" distB="0" distL="0" distR="0">
+            <wp:extent cx="5905500" cy="3714750"/>
+            <wp:effectExtent t="0" r="0" b="0" l="0"/>
+            <wp:docPr id="1" name="03_swagger_projects.png" descr="03_swagger_projects.png" title="03_swagger_projects.png"/>
+            <wp:cNvGraphicFramePr>
+              <a:graphicFrameLocks xmlns:a="http://schemas.openxmlformats.org/drawingml/2006/main" noChangeAspect="1"/>
+            </wp:cNvGraphicFramePr>
+            <a:graphic xmlns:a="http://schemas.openxmlformats.org/drawingml/2006/main">
+              <a:graphicData uri="http://schemas.openxmlformats.org/drawingml/2006/picture">
+                <pic:pic xmlns:pic="http://schemas.openxmlformats.org/drawingml/2006/picture">
+                  <pic:nvPicPr>
+                    <pic:cNvPr id="0" name="" descr=""/>
+                    <pic:cNvPicPr>
+                      <a:picLocks noChangeAspect="1" noChangeArrowheads="1"/>
+                    </pic:cNvPicPr>
+                  </pic:nvPicPr>
+                  <pic:blipFill>
+                    <a:blip r:embed="rId11" cstate="none"/>
+                    <a:srcRect/>
+                    <a:stretch>
+                      <a:fillRect/>
+                    </a:stretch>
+                  </pic:blipFill>
+                  <pic:spPr bwMode="auto">
+                    <a:xfrm>
+                      <a:off x="0" y="0"/>
+                      <a:ext cx="5905500" cy="3714750"/>
+                    </a:xfrm>
+                    <a:prstGeom prst="rect">
+                      <a:avLst/>
+                    </a:prstGeom>
+                  </pic:spPr>
+                </pic:pic>
+              </a:graphicData>
+            </a:graphic>
+          </wp:inline>
+        </w:drawing>
+      </w:r>
+    </w:p>
+    <w:p>
+      <w:pPr>
+        <w:spacing w:after="160" w:before="0"/>
+        <w:jc w:val="center"/>
+      </w:pPr>
+      <w:r>
+        <w:rPr>
+          <w:rFonts w:ascii="Arial" w:cs="Arial" w:eastAsia="Arial" w:hAnsi="Arial"/>
+          <w:i/>
+          <w:iCs/>
+          <w:color w:val="666666"/>
+          <w:sz w:val="16"/>
+          <w:szCs w:val="16"/>
+        </w:rPr>
+        <w:t xml:space="preserve">Fig 3 — New Projects endpoints: CRUD, /tasks, /stats (Week 6 addition)</w:t>
+      </w:r>
+    </w:p>
+    <w:p>
+      <w:pPr>
+        <w:pStyle w:val="Heading2"/>
+        <w:spacing w:after="80" w:before="200"/>
+      </w:pPr>
+      <w:r>
+        <w:rPr>
+          <w:rFonts w:ascii="Arial" w:cs="Arial" w:eastAsia="Arial" w:hAnsi="Arial"/>
+          <w:b/>
+          <w:bCs/>
+          <w:color w:val="2E75B6"/>
+          <w:sz w:val="24"/>
+          <w:szCs w:val="24"/>
+        </w:rPr>
+        <w:t xml:space="preserve">10.4  Comments API Endpoints</w:t>
+      </w:r>
+    </w:p>
+    <w:p>
+      <w:pPr>
+        <w:spacing w:after="120" w:before="120"/>
+        <w:jc w:val="center"/>
+      </w:pPr>
+      <w:r>
+        <w:drawing>
+          <wp:inline distT="0" distB="0" distL="0" distR="0">
+            <wp:extent cx="5905500" cy="3714750"/>
+            <wp:effectExtent t="0" r="0" b="0" l="0"/>
+            <wp:docPr id="1" name="04_swagger_comments.png" descr="04_swagger_comments.png" title="04_swagger_comments.png"/>
+            <wp:cNvGraphicFramePr>
+              <a:graphicFrameLocks xmlns:a="http://schemas.openxmlformats.org/drawingml/2006/main" noChangeAspect="1"/>
+            </wp:cNvGraphicFramePr>
+            <a:graphic xmlns:a="http://schemas.openxmlformats.org/drawingml/2006/main">
+              <a:graphicData uri="http://schemas.openxmlformats.org/drawingml/2006/picture">
+                <pic:pic xmlns:pic="http://schemas.openxmlformats.org/drawingml/2006/picture">
+                  <pic:nvPicPr>
+                    <pic:cNvPr id="0" name="" descr=""/>
+                    <pic:cNvPicPr>
+                      <a:picLocks noChangeAspect="1" noChangeArrowheads="1"/>
+                    </pic:cNvPicPr>
+                  </pic:nvPicPr>
+                  <pic:blipFill>
+                    <a:blip r:embed="rId12" cstate="none"/>
+                    <a:srcRect/>
+                    <a:stretch>
+                      <a:fillRect/>
+                    </a:stretch>
+                  </pic:blipFill>
+                  <pic:spPr bwMode="auto">
+                    <a:xfrm>
+                      <a:off x="0" y="0"/>
+                      <a:ext cx="5905500" cy="3714750"/>
+                    </a:xfrm>
+                    <a:prstGeom prst="rect">
+                      <a:avLst/>
+                    </a:prstGeom>
+                  </pic:spPr>
+                </pic:pic>
+              </a:graphicData>
+            </a:graphic>
+          </wp:inline>
+        </w:drawing>
+      </w:r>
+    </w:p>
+    <w:p>
+      <w:pPr>
+        <w:spacing w:after="160" w:before="0"/>
+        <w:jc w:val="center"/>
+      </w:pPr>
+      <w:r>
+        <w:rPr>
+          <w:rFonts w:ascii="Arial" w:cs="Arial" w:eastAsia="Arial" w:hAnsi="Arial"/>
+          <w:i/>
+          <w:iCs/>
+          <w:color w:val="666666"/>
+          <w:sz w:val="16"/>
+          <w:szCs w:val="16"/>
+        </w:rPr>
+        <w:t xml:space="preserve">Fig 4 — New Comments endpoints for task collaboration (Week 6 addition)</w:t>
+      </w:r>
+    </w:p>
+    <w:p>
+      <w:pPr>
+        <w:pStyle w:val="Heading2"/>
+        <w:spacing w:after="80" w:before="200"/>
+      </w:pPr>
+      <w:r>
+        <w:rPr>
+          <w:rFonts w:ascii="Arial" w:cs="Arial" w:eastAsia="Arial" w:hAnsi="Arial"/>
+          <w:b/>
+          <w:bCs/>
+          <w:color w:val="2E75B6"/>
+          <w:sz w:val="24"/>
+          <w:szCs w:val="24"/>
+        </w:rPr>
+        <w:t xml:space="preserve">10.5  H2 In-Memory Database Console</w:t>
+      </w:r>
+    </w:p>
+    <w:p>
+      <w:pPr>
+        <w:spacing w:after="120" w:before="120"/>
+        <w:jc w:val="center"/>
+      </w:pPr>
+      <w:r>
+        <w:drawing>
+          <wp:inline distT="0" distB="0" distL="0" distR="0">
+            <wp:extent cx="5905500" cy="3714750"/>
+            <wp:effectExtent t="0" r="0" b="0" l="0"/>
+            <wp:docPr id="1" name="05_h2_console.png" descr="05_h2_console.png" title="05_h2_console.png"/>
+            <wp:cNvGraphicFramePr>
+              <a:graphicFrameLocks xmlns:a="http://schemas.openxmlformats.org/drawingml/2006/main" noChangeAspect="1"/>
+            </wp:cNvGraphicFramePr>
+            <a:graphic xmlns:a="http://schemas.openxmlformats.org/drawingml/2006/main">
+              <a:graphicData uri="http://schemas.openxmlformats.org/drawingml/2006/picture">
+                <pic:pic xmlns:pic="http://schemas.openxmlformats.org/drawingml/2006/picture">
+                  <pic:nvPicPr>
+                    <pic:cNvPr id="0" name="" descr=""/>
+                    <pic:cNvPicPr>
+                      <a:picLocks noChangeAspect="1" noChangeArrowheads="1"/>
+                    </pic:cNvPicPr>
+                  </pic:nvPicPr>
+                  <pic:blipFill>
+                    <a:blip r:embed="rId13" cstate="none"/>
+                    <a:srcRect/>
+                    <a:stretch>
+                      <a:fillRect/>
+                    </a:stretch>
+                  </pic:blipFill>
+                  <pic:spPr bwMode="auto">
+                    <a:xfrm>
+                      <a:off x="0" y="0"/>
+                      <a:ext cx="5905500" cy="3714750"/>
+                    </a:xfrm>
+                    <a:prstGeom prst="rect">
+                      <a:avLst/>
+                    </a:prstGeom>
+                  </pic:spPr>
+                </pic:pic>
+              </a:graphicData>
+            </a:graphic>
+          </wp:inline>
+        </w:drawing>
+      </w:r>
+    </w:p>
+    <w:p>
+      <w:pPr>
+        <w:spacing w:after="160" w:before="0"/>
+        <w:jc w:val="center"/>
+      </w:pPr>
+      <w:r>
+        <w:rPr>
+          <w:rFonts w:ascii="Arial" w:cs="Arial" w:eastAsia="Arial" w:hAnsi="Arial"/>
+          <w:i/>
+          <w:iCs/>
+          <w:color w:val="666666"/>
+          <w:sz w:val="16"/>
+          <w:szCs w:val="16"/>
+        </w:rPr>
+        <w:t xml:space="preserve">Fig 5 — H2 Console at /h2-console — dev database browser</w:t>
+      </w:r>
+    </w:p>
+    <w:p>
+      <w:pPr>
+        <w:pStyle w:val="Heading2"/>
+        <w:spacing w:after="80" w:before="200"/>
+      </w:pPr>
+      <w:r>
+        <w:rPr>
+          <w:rFonts w:ascii="Arial" w:cs="Arial" w:eastAsia="Arial" w:hAnsi="Arial"/>
+          <w:b/>
+          <w:bCs/>
+          <w:color w:val="2E75B6"/>
+          <w:sz w:val="24"/>
+          <w:szCs w:val="24"/>
+        </w:rPr>
+        <w:t xml:space="preserve">10.6  Projects API Response (Paginated)</w:t>
+      </w:r>
+    </w:p>
+    <w:p>
+      <w:pPr>
+        <w:spacing w:after="120" w:before="120"/>
+        <w:jc w:val="center"/>
+      </w:pPr>
+      <w:r>
+        <w:drawing>
+          <wp:inline distT="0" distB="0" distL="0" distR="0">
+            <wp:extent cx="5905500" cy="3714750"/>
+            <wp:effectExtent t="0" r="0" b="0" l="0"/>
+            <wp:docPr id="1" name="06_api_projects_response.png" descr="06_api_projects_response.png" title="06_api_projects_response.png"/>
+            <wp:cNvGraphicFramePr>
+              <a:graphicFrameLocks xmlns:a="http://schemas.openxmlformats.org/drawingml/2006/main" noChangeAspect="1"/>
+            </wp:cNvGraphicFramePr>
+            <a:graphic xmlns:a="http://schemas.openxmlformats.org/drawingml/2006/main">
+              <a:graphicData uri="http://schemas.openxmlformats.org/drawingml/2006/picture">
+                <pic:pic xmlns:pic="http://schemas.openxmlformats.org/drawingml/2006/picture">
+                  <pic:nvPicPr>
+                    <pic:cNvPr id="0" name="" descr=""/>
+                    <pic:cNvPicPr>
+                      <a:picLocks noChangeAspect="1" noChangeArrowheads="1"/>
+                    </pic:cNvPicPr>
+                  </pic:nvPicPr>
+                  <pic:blipFill>
+                    <a:blip r:embed="rId14" cstate="none"/>
+                    <a:srcRect/>
+                    <a:stretch>
+                      <a:fillRect/>
+                    </a:stretch>
+                  </pic:blipFill>
+                  <pic:spPr bwMode="auto">
+                    <a:xfrm>
+                      <a:off x="0" y="0"/>
+                      <a:ext cx="5905500" cy="3714750"/>
+                    </a:xfrm>
+                    <a:prstGeom prst="rect">
+                      <a:avLst/>
+                    </a:prstGeom>
+                  </pic:spPr>
+                </pic:pic>
+              </a:graphicData>
+            </a:graphic>
+          </wp:inline>
+        </w:drawing>
+      </w:r>
+    </w:p>
+    <w:p>
+      <w:pPr>
+        <w:spacing w:after="160" w:before="0"/>
+        <w:jc w:val="center"/>
+      </w:pPr>
+      <w:r>
+        <w:rPr>
+          <w:rFonts w:ascii="Arial" w:cs="Arial" w:eastAsia="Arial" w:hAnsi="Arial"/>
+          <w:i/>
+          <w:iCs/>
+          <w:color w:val="666666"/>
+          <w:sz w:val="16"/>
+          <w:szCs w:val="16"/>
+        </w:rPr>
+        <w:t xml:space="preserve">Fig 6 — GET /api/projects — paginated response with taskCount and owner info</w:t>
+      </w:r>
+    </w:p>
+    <w:p>
+      <w:pPr>
+        <w:pStyle w:val="Heading2"/>
+        <w:spacing w:after="80" w:before="200"/>
+      </w:pPr>
+      <w:r>
+        <w:rPr>
+          <w:rFonts w:ascii="Arial" w:cs="Arial" w:eastAsia="Arial" w:hAnsi="Arial"/>
+          <w:b/>
+          <w:bCs/>
+          <w:color w:val="2E75B6"/>
+          <w:sz w:val="24"/>
+          <w:szCs w:val="24"/>
+        </w:rPr>
+        <w:t xml:space="preserve">10.7  Tasks Paginated API Response</w:t>
+      </w:r>
+    </w:p>
+    <w:p>
+      <w:pPr>
+        <w:spacing w:after="120" w:before="120"/>
+        <w:jc w:val="center"/>
+      </w:pPr>
+      <w:r>
+        <w:drawing>
+          <wp:inline distT="0" distB="0" distL="0" distR="0">
+            <wp:extent cx="5905500" cy="3714750"/>
+            <wp:effectExtent t="0" r="0" b="0" l="0"/>
+            <wp:docPr id="1" name="07_api_tasks_paged.png" descr="07_api_tasks_paged.png" title="07_api_tasks_paged.png"/>
+            <wp:cNvGraphicFramePr>
+              <a:graphicFrameLocks xmlns:a="http://schemas.openxmlformats.org/drawingml/2006/main" noChangeAspect="1"/>
+            </wp:cNvGraphicFramePr>
+            <a:graphic xmlns:a="http://schemas.openxmlformats.org/drawingml/2006/main">
+              <a:graphicData uri="http://schemas.openxmlformats.org/drawingml/2006/picture">
+                <pic:pic xmlns:pic="http://schemas.openxmlformats.org/drawingml/2006/picture">
+                  <pic:nvPicPr>
+                    <pic:cNvPr id="0" name="" descr=""/>
+                    <pic:cNvPicPr>
+                      <a:picLocks noChangeAspect="1" noChangeArrowheads="1"/>
+                    </pic:cNvPicPr>
+                  </pic:nvPicPr>
+                  <pic:blipFill>
+                    <a:blip r:embed="rId15" cstate="none"/>
+                    <a:srcRect/>
+                    <a:stretch>
+                      <a:fillRect/>
+                    </a:stretch>
+                  </pic:blipFill>
+                  <pic:spPr bwMode="auto">
+                    <a:xfrm>
+                      <a:off x="0" y="0"/>
+                      <a:ext cx="5905500" cy="3714750"/>
+                    </a:xfrm>
+                    <a:prstGeom prst="rect">
+                      <a:avLst/>
+                    </a:prstGeom>
+                  </pic:spPr>
+                </pic:pic>
+              </a:graphicData>
+            </a:graphic>
+          </wp:inline>
+        </w:drawing>
+      </w:r>
+    </w:p>
+    <w:p>
+      <w:pPr>
+        <w:spacing w:after="160" w:before="0"/>
+        <w:jc w:val="center"/>
+      </w:pPr>
+      <w:r>
+        <w:rPr>
+          <w:rFonts w:ascii="Arial" w:cs="Arial" w:eastAsia="Arial" w:hAnsi="Arial"/>
+          <w:i/>
+          <w:iCs/>
+          <w:color w:val="666666"/>
+          <w:sz w:val="16"/>
+          <w:szCs w:val="16"/>
+        </w:rPr>
+        <w:t xml:space="preserve">Fig 7 — GET /api/tasks/paged — PagedResponse with page metadata</w:t>
+      </w:r>
+    </w:p>
+    <w:p>
+      <w:pPr>
+        <w:pStyle w:val="Heading2"/>
+        <w:spacing w:after="80" w:before="200"/>
+      </w:pPr>
+      <w:r>
+        <w:rPr>
+          <w:rFonts w:ascii="Arial" w:cs="Arial" w:eastAsia="Arial" w:hAnsi="Arial"/>
+          <w:b/>
+          <w:bCs/>
+          <w:color w:val="2E75B6"/>
+          <w:sz w:val="24"/>
+          <w:szCs w:val="24"/>
+        </w:rPr>
+        <w:t xml:space="preserve">10.8  Task Comments API Response</w:t>
+      </w:r>
+    </w:p>
+    <w:p>
+      <w:pPr>
+        <w:spacing w:after="120" w:before="120"/>
+        <w:jc w:val="center"/>
+      </w:pPr>
+      <w:r>
+        <w:drawing>
+          <wp:inline distT="0" distB="0" distL="0" distR="0">
+            <wp:extent cx="5905500" cy="3714750"/>
+            <wp:effectExtent t="0" r="0" b="0" l="0"/>
+            <wp:docPr id="1" name="08_api_comments_response.png" descr="08_api_comments_response.png" title="08_api_comments_response.png"/>
+            <wp:cNvGraphicFramePr>
+              <a:graphicFrameLocks xmlns:a="http://schemas.openxmlformats.org/drawingml/2006/main" noChangeAspect="1"/>
+            </wp:cNvGraphicFramePr>
+            <a:graphic xmlns:a="http://schemas.openxmlformats.org/drawingml/2006/main">
+              <a:graphicData uri="http://schemas.openxmlformats.org/drawingml/2006/picture">
+                <pic:pic xmlns:pic="http://schemas.openxmlformats.org/drawingml/2006/picture">
+                  <pic:nvPicPr>
+                    <pic:cNvPr id="0" name="" descr=""/>
+                    <pic:cNvPicPr>
+                      <a:picLocks noChangeAspect="1" noChangeArrowheads="1"/>
+                    </pic:cNvPicPr>
+                  </pic:nvPicPr>
+                  <pic:blipFill>
+                    <a:blip r:embed="rId16" cstate="none"/>
+                    <a:srcRect/>
+                    <a:stretch>
+                      <a:fillRect/>
+                    </a:stretch>
+                  </pic:blipFill>
+                  <pic:spPr bwMode="auto">
+                    <a:xfrm>
+                      <a:off x="0" y="0"/>
+                      <a:ext cx="5905500" cy="3714750"/>
+                    </a:xfrm>
+                    <a:prstGeom prst="rect">
+                      <a:avLst/>
+                    </a:prstGeom>
+                  </pic:spPr>
+                </pic:pic>
+              </a:graphicData>
+            </a:graphic>
+          </wp:inline>
+        </w:drawing>
+      </w:r>
+    </w:p>
+    <w:p>
+      <w:pPr>
+        <w:spacing w:after="160" w:before="0"/>
+        <w:jc w:val="center"/>
+      </w:pPr>
+      <w:r>
+        <w:rPr>
+          <w:rFonts w:ascii="Arial" w:cs="Arial" w:eastAsia="Arial" w:hAnsi="Arial"/>
+          <w:i/>
+          <w:iCs/>
+          <w:color w:val="666666"/>
+          <w:sz w:val="16"/>
+          <w:szCs w:val="16"/>
+        </w:rPr>
+        <w:t xml:space="preserve">Fig 8 — GET /api/tasks/1/comments — comments with author info ordered newest-first</w:t>
+      </w:r>
+    </w:p>
+    <w:p>
+      <w:pPr>
+        <w:pStyle w:val="Heading2"/>
+        <w:spacing w:after="80" w:before="200"/>
+      </w:pPr>
+      <w:r>
+        <w:rPr>
+          <w:rFonts w:ascii="Arial" w:cs="Arial" w:eastAsia="Arial" w:hAnsi="Arial"/>
+          <w:b/>
+          <w:bCs/>
+          <w:color w:val="2E75B6"/>
+          <w:sz w:val="24"/>
+          <w:szCs w:val="24"/>
+        </w:rPr>
+        <w:t xml:space="preserve">10.9  Project Stats API Response</w:t>
+      </w:r>
+    </w:p>
+    <w:p>
+      <w:pPr>
+        <w:spacing w:after="120" w:before="120"/>
+        <w:jc w:val="center"/>
+      </w:pPr>
+      <w:r>
+        <w:drawing>
+          <wp:inline distT="0" distB="0" distL="0" distR="0">
+            <wp:extent cx="5905500" cy="3714750"/>
+            <wp:effectExtent t="0" r="0" b="0" l="0"/>
+            <wp:docPr id="1" name="09_project_stats_response.png" descr="09_project_stats_response.png" title="09_project_stats_response.png"/>
+            <wp:cNvGraphicFramePr>
+              <a:graphicFrameLocks xmlns:a="http://schemas.openxmlformats.org/drawingml/2006/main" noChangeAspect="1"/>
+            </wp:cNvGraphicFramePr>
+            <a:graphic xmlns:a="http://schemas.openxmlformats.org/drawingml/2006/main">
+              <a:graphicData uri="http://schemas.openxmlformats.org/drawingml/2006/picture">
+                <pic:pic xmlns:pic="http://schemas.openxmlformats.org/drawingml/2006/picture">
+                  <pic:nvPicPr>
+                    <pic:cNvPr id="0" name="" descr=""/>
+                    <pic:cNvPicPr>
+                      <a:picLocks noChangeAspect="1" noChangeArrowheads="1"/>
+                    </pic:cNvPicPr>
+                  </pic:nvPicPr>
+                  <pic:blipFill>
+                    <a:blip r:embed="rId17" cstate="none"/>
+                    <a:srcRect/>
+                    <a:stretch>
+                      <a:fillRect/>
+                    </a:stretch>
+                  </pic:blipFill>
+                  <pic:spPr bwMode="auto">
+                    <a:xfrm>
+                      <a:off x="0" y="0"/>
+                      <a:ext cx="5905500" cy="3714750"/>
+                    </a:xfrm>
+                    <a:prstGeom prst="rect">
+                      <a:avLst/>
+                    </a:prstGeom>
+                  </pic:spPr>
+                </pic:pic>
+              </a:graphicData>
+            </a:graphic>
+          </wp:inline>
+        </w:drawing>
+      </w:r>
+    </w:p>
+    <w:p>
+      <w:pPr>
+        <w:spacing w:after="160" w:before="0"/>
+        <w:jc w:val="center"/>
+      </w:pPr>
+      <w:r>
+        <w:rPr>
+          <w:rFonts w:ascii="Arial" w:cs="Arial" w:eastAsia="Arial" w:hAnsi="Arial"/>
+          <w:i/>
+          <w:iCs/>
+          <w:color w:val="666666"/>
+          <w:sz w:val="16"/>
+          <w:szCs w:val="16"/>
+        </w:rPr>
+        <w:t xml:space="preserve">Fig 9 — GET /api/projects/1/stats — task status breakdown using aggregate query</w:t>
       </w:r>
     </w:p>
     <w:p>

</xml_diff>